<commit_message>
desafio 2 codigo final e informe
</commit_message>
<xml_diff>
--- a/Desafio2/Informe desafío dos.docx
+++ b/Desafio2/Informe desafío dos.docx
@@ -7,34 +7,18 @@
         <w:spacing w:line="360" w:lineRule="auto"/>
         <w:jc w:val="center"/>
         <w:rPr>
-          <w:rFonts w:ascii="Times New Roman" w:hAnsi="Times New Roman" w:cs="Times New Roman"/>
+          <w:rFonts w:ascii="Arial" w:hAnsi="Arial" w:cs="Arial"/>
           <w:sz w:val="44"/>
           <w:szCs w:val="44"/>
         </w:rPr>
       </w:pPr>
       <w:r>
         <w:rPr>
-          <w:rFonts w:ascii="Times New Roman" w:hAnsi="Times New Roman" w:cs="Times New Roman"/>
+          <w:rFonts w:ascii="Arial" w:hAnsi="Arial" w:cs="Arial"/>
           <w:sz w:val="44"/>
           <w:szCs w:val="44"/>
         </w:rPr>
-        <w:t xml:space="preserve">Informe desafío </w:t>
-      </w:r>
-      <w:r>
-        <w:rPr>
-          <w:rFonts w:ascii="Times New Roman" w:hAnsi="Times New Roman" w:cs="Times New Roman"/>
-          <w:sz w:val="44"/>
-          <w:szCs w:val="44"/>
-        </w:rPr>
-        <w:t>dos</w:t>
-      </w:r>
-      <w:r>
-        <w:rPr>
-          <w:rFonts w:ascii="Times New Roman" w:hAnsi="Times New Roman" w:cs="Times New Roman"/>
-          <w:sz w:val="44"/>
-          <w:szCs w:val="44"/>
-        </w:rPr>
-        <w:t>.</w:t>
+        <w:t>Informe desafío dos.</w:t>
       </w:r>
     </w:p>
     <w:p>
@@ -42,7 +26,7 @@
         <w:spacing w:line="360" w:lineRule="auto"/>
         <w:jc w:val="center"/>
         <w:rPr>
-          <w:rFonts w:ascii="Times New Roman" w:hAnsi="Times New Roman" w:cs="Times New Roman"/>
+          <w:rFonts w:ascii="Arial" w:hAnsi="Arial" w:cs="Arial"/>
           <w:sz w:val="32"/>
           <w:szCs w:val="32"/>
         </w:rPr>
@@ -53,7 +37,7 @@
         <w:spacing w:line="360" w:lineRule="auto"/>
         <w:jc w:val="center"/>
         <w:rPr>
-          <w:rFonts w:ascii="Times New Roman" w:hAnsi="Times New Roman" w:cs="Times New Roman"/>
+          <w:rFonts w:ascii="Arial" w:hAnsi="Arial" w:cs="Arial"/>
           <w:sz w:val="32"/>
           <w:szCs w:val="32"/>
         </w:rPr>
@@ -64,7 +48,7 @@
         <w:spacing w:line="360" w:lineRule="auto"/>
         <w:jc w:val="center"/>
         <w:rPr>
-          <w:rFonts w:ascii="Times New Roman" w:hAnsi="Times New Roman" w:cs="Times New Roman"/>
+          <w:rFonts w:ascii="Arial" w:hAnsi="Arial" w:cs="Arial"/>
           <w:sz w:val="32"/>
           <w:szCs w:val="32"/>
         </w:rPr>
@@ -75,34 +59,37 @@
         <w:spacing w:line="360" w:lineRule="auto"/>
         <w:jc w:val="center"/>
         <w:rPr>
-          <w:rFonts w:ascii="Times New Roman" w:hAnsi="Times New Roman" w:cs="Times New Roman"/>
+          <w:rFonts w:ascii="Arial" w:hAnsi="Arial" w:cs="Arial"/>
           <w:sz w:val="32"/>
           <w:szCs w:val="32"/>
         </w:rPr>
       </w:pPr>
       <w:r>
         <w:rPr>
-          <w:rFonts w:ascii="Times New Roman" w:hAnsi="Times New Roman" w:cs="Times New Roman"/>
+          <w:rFonts w:ascii="Arial" w:hAnsi="Arial" w:cs="Arial"/>
           <w:sz w:val="32"/>
           <w:szCs w:val="32"/>
         </w:rPr>
-        <w:t>Ian Andrés Duque Peñafiel</w:t>
-      </w:r>
-      <w:r>
-        <w:rPr>
-          <w:rFonts w:ascii="Times New Roman" w:hAnsi="Times New Roman" w:cs="Times New Roman"/>
+        <w:t>Ian Andrés Duque Peñafiel.</w:t>
+      </w:r>
+    </w:p>
+    <w:p>
+      <w:pPr>
+        <w:spacing w:line="360" w:lineRule="auto"/>
+        <w:jc w:val="center"/>
+        <w:rPr>
+          <w:rFonts w:ascii="Arial" w:hAnsi="Arial" w:cs="Arial"/>
           <w:sz w:val="32"/>
           <w:szCs w:val="32"/>
         </w:rPr>
-        <w:t>.</w:t>
-      </w:r>
+      </w:pPr>
     </w:p>
     <w:p>
       <w:pPr>
         <w:spacing w:line="360" w:lineRule="auto"/>
         <w:jc w:val="center"/>
         <w:rPr>
-          <w:rFonts w:ascii="Times New Roman" w:hAnsi="Times New Roman" w:cs="Times New Roman"/>
+          <w:rFonts w:ascii="Arial" w:hAnsi="Arial" w:cs="Arial"/>
           <w:sz w:val="32"/>
           <w:szCs w:val="32"/>
         </w:rPr>
@@ -113,7 +100,7 @@
         <w:spacing w:line="360" w:lineRule="auto"/>
         <w:jc w:val="center"/>
         <w:rPr>
-          <w:rFonts w:ascii="Times New Roman" w:hAnsi="Times New Roman" w:cs="Times New Roman"/>
+          <w:rFonts w:ascii="Arial" w:hAnsi="Arial" w:cs="Arial"/>
           <w:sz w:val="32"/>
           <w:szCs w:val="32"/>
         </w:rPr>
@@ -124,7 +111,7 @@
         <w:spacing w:line="360" w:lineRule="auto"/>
         <w:jc w:val="center"/>
         <w:rPr>
-          <w:rFonts w:ascii="Times New Roman" w:hAnsi="Times New Roman" w:cs="Times New Roman"/>
+          <w:rFonts w:ascii="Arial" w:hAnsi="Arial" w:cs="Arial"/>
           <w:sz w:val="32"/>
           <w:szCs w:val="32"/>
         </w:rPr>
@@ -135,37 +122,37 @@
         <w:spacing w:line="360" w:lineRule="auto"/>
         <w:jc w:val="center"/>
         <w:rPr>
-          <w:rFonts w:ascii="Times New Roman" w:hAnsi="Times New Roman" w:cs="Times New Roman"/>
+          <w:rFonts w:ascii="Arial" w:hAnsi="Arial" w:cs="Arial"/>
           <w:sz w:val="32"/>
           <w:szCs w:val="32"/>
         </w:rPr>
       </w:pPr>
-    </w:p>
-    <w:p>
-      <w:pPr>
-        <w:spacing w:line="360" w:lineRule="auto"/>
-        <w:jc w:val="center"/>
-        <w:rPr>
-          <w:rFonts w:ascii="Times New Roman" w:hAnsi="Times New Roman" w:cs="Times New Roman"/>
+      <w:r>
+        <w:rPr>
+          <w:rFonts w:ascii="Arial" w:hAnsi="Arial" w:cs="Arial"/>
           <w:sz w:val="32"/>
           <w:szCs w:val="32"/>
         </w:rPr>
-      </w:pPr>
-      <w:r>
-        <w:rPr>
-          <w:rFonts w:ascii="Times New Roman" w:hAnsi="Times New Roman" w:cs="Times New Roman"/>
+        <w:t>Informática 2.</w:t>
+      </w:r>
+    </w:p>
+    <w:p>
+      <w:pPr>
+        <w:spacing w:line="360" w:lineRule="auto"/>
+        <w:jc w:val="center"/>
+        <w:rPr>
+          <w:rFonts w:ascii="Arial" w:hAnsi="Arial" w:cs="Arial"/>
           <w:sz w:val="32"/>
           <w:szCs w:val="32"/>
         </w:rPr>
-        <w:t>Informática 2.</w:t>
-      </w:r>
+      </w:pPr>
     </w:p>
     <w:p>
       <w:pPr>
         <w:spacing w:line="360" w:lineRule="auto"/>
         <w:jc w:val="center"/>
         <w:rPr>
-          <w:rFonts w:ascii="Times New Roman" w:hAnsi="Times New Roman" w:cs="Times New Roman"/>
+          <w:rFonts w:ascii="Arial" w:hAnsi="Arial" w:cs="Arial"/>
           <w:sz w:val="32"/>
           <w:szCs w:val="32"/>
         </w:rPr>
@@ -176,7 +163,7 @@
         <w:spacing w:line="360" w:lineRule="auto"/>
         <w:jc w:val="center"/>
         <w:rPr>
-          <w:rFonts w:ascii="Times New Roman" w:hAnsi="Times New Roman" w:cs="Times New Roman"/>
+          <w:rFonts w:ascii="Arial" w:hAnsi="Arial" w:cs="Arial"/>
           <w:sz w:val="32"/>
           <w:szCs w:val="32"/>
         </w:rPr>
@@ -187,37 +174,37 @@
         <w:spacing w:line="360" w:lineRule="auto"/>
         <w:jc w:val="center"/>
         <w:rPr>
-          <w:rFonts w:ascii="Times New Roman" w:hAnsi="Times New Roman" w:cs="Times New Roman"/>
+          <w:rFonts w:ascii="Arial" w:hAnsi="Arial" w:cs="Arial"/>
           <w:sz w:val="32"/>
           <w:szCs w:val="32"/>
         </w:rPr>
       </w:pPr>
-    </w:p>
-    <w:p>
-      <w:pPr>
-        <w:spacing w:line="360" w:lineRule="auto"/>
-        <w:jc w:val="center"/>
-        <w:rPr>
-          <w:rFonts w:ascii="Times New Roman" w:hAnsi="Times New Roman" w:cs="Times New Roman"/>
+      <w:r>
+        <w:rPr>
+          <w:rFonts w:ascii="Arial" w:hAnsi="Arial" w:cs="Arial"/>
           <w:sz w:val="32"/>
           <w:szCs w:val="32"/>
         </w:rPr>
-      </w:pPr>
-      <w:r>
-        <w:rPr>
-          <w:rFonts w:ascii="Times New Roman" w:hAnsi="Times New Roman" w:cs="Times New Roman"/>
+        <w:t>Aníbal José Guerra Soler.</w:t>
+      </w:r>
+    </w:p>
+    <w:p>
+      <w:pPr>
+        <w:spacing w:line="360" w:lineRule="auto"/>
+        <w:jc w:val="center"/>
+        <w:rPr>
+          <w:rFonts w:ascii="Arial" w:hAnsi="Arial" w:cs="Arial"/>
           <w:sz w:val="32"/>
           <w:szCs w:val="32"/>
         </w:rPr>
-        <w:t>Aníbal José Guerra Soler.</w:t>
-      </w:r>
+      </w:pPr>
     </w:p>
     <w:p>
       <w:pPr>
         <w:spacing w:line="360" w:lineRule="auto"/>
         <w:jc w:val="center"/>
         <w:rPr>
-          <w:rFonts w:ascii="Times New Roman" w:hAnsi="Times New Roman" w:cs="Times New Roman"/>
+          <w:rFonts w:ascii="Arial" w:hAnsi="Arial" w:cs="Arial"/>
           <w:sz w:val="32"/>
           <w:szCs w:val="32"/>
         </w:rPr>
@@ -228,7 +215,7 @@
         <w:spacing w:line="360" w:lineRule="auto"/>
         <w:jc w:val="center"/>
         <w:rPr>
-          <w:rFonts w:ascii="Times New Roman" w:hAnsi="Times New Roman" w:cs="Times New Roman"/>
+          <w:rFonts w:ascii="Arial" w:hAnsi="Arial" w:cs="Arial"/>
           <w:sz w:val="32"/>
           <w:szCs w:val="32"/>
         </w:rPr>
@@ -239,126 +226,91 @@
         <w:spacing w:line="360" w:lineRule="auto"/>
         <w:jc w:val="center"/>
         <w:rPr>
-          <w:rFonts w:ascii="Times New Roman" w:hAnsi="Times New Roman" w:cs="Times New Roman"/>
+          <w:rFonts w:ascii="Arial" w:hAnsi="Arial" w:cs="Arial"/>
           <w:sz w:val="32"/>
           <w:szCs w:val="32"/>
         </w:rPr>
       </w:pPr>
-    </w:p>
-    <w:p>
-      <w:pPr>
-        <w:spacing w:line="360" w:lineRule="auto"/>
-        <w:jc w:val="center"/>
-        <w:rPr>
-          <w:rFonts w:ascii="Times New Roman" w:hAnsi="Times New Roman" w:cs="Times New Roman"/>
+      <w:r>
+        <w:rPr>
+          <w:rFonts w:ascii="Arial" w:hAnsi="Arial" w:cs="Arial"/>
           <w:sz w:val="32"/>
           <w:szCs w:val="32"/>
         </w:rPr>
-      </w:pPr>
-      <w:r>
-        <w:rPr>
-          <w:rFonts w:ascii="Times New Roman" w:hAnsi="Times New Roman" w:cs="Times New Roman"/>
+        <w:t>12/10/2024.</w:t>
+      </w:r>
+    </w:p>
+    <w:p>
+      <w:pPr>
+        <w:spacing w:line="360" w:lineRule="auto"/>
+        <w:jc w:val="center"/>
+        <w:rPr>
+          <w:rFonts w:ascii="Arial" w:hAnsi="Arial" w:cs="Arial"/>
           <w:sz w:val="32"/>
           <w:szCs w:val="32"/>
         </w:rPr>
-        <w:t>12</w:t>
-      </w:r>
-      <w:r>
-        <w:rPr>
-          <w:rFonts w:ascii="Times New Roman" w:hAnsi="Times New Roman" w:cs="Times New Roman"/>
+      </w:pPr>
+      <w:r>
+        <w:rPr>
+          <w:rFonts w:ascii="Arial" w:hAnsi="Arial" w:cs="Arial"/>
           <w:sz w:val="32"/>
           <w:szCs w:val="32"/>
         </w:rPr>
-        <w:t>/</w:t>
-      </w:r>
-      <w:r>
-        <w:rPr>
-          <w:rFonts w:ascii="Times New Roman" w:hAnsi="Times New Roman" w:cs="Times New Roman"/>
+        <w:lastRenderedPageBreak/>
+        <w:t>Análisis del problema</w:t>
+      </w:r>
+    </w:p>
+    <w:p>
+      <w:pPr>
+        <w:spacing w:line="360" w:lineRule="auto"/>
+        <w:rPr>
+          <w:rFonts w:ascii="Arial" w:hAnsi="Arial" w:cs="Arial"/>
+        </w:rPr>
+      </w:pPr>
+      <w:r>
+        <w:rPr>
+          <w:rFonts w:ascii="Arial" w:hAnsi="Arial" w:cs="Arial"/>
+        </w:rPr>
+        <w:t xml:space="preserve">De manera resumida el problema planteado </w:t>
+      </w:r>
+      <w:r>
+        <w:rPr>
+          <w:rFonts w:ascii="Arial" w:hAnsi="Arial" w:cs="Arial"/>
+        </w:rPr>
+        <w:t>consistiría en encontrar una manera de generar estaciones de servicio</w:t>
+      </w:r>
+      <w:r>
+        <w:rPr>
+          <w:rFonts w:ascii="Arial" w:hAnsi="Arial" w:cs="Arial"/>
+        </w:rPr>
+        <w:t xml:space="preserve"> con (2-12) surtidores que sean capaces de realizar ventas de 3 tipos de combustibles diferentes, cada estación de servicio puede corresponder a una región(norte, central, sur), cada estación debe ser capaz de mostrar el historial de ventas de cada uno de sus surtidores, la cantidad de litros de cada tipo de combustible vendidos en total en la estación y llevar control sobre sus surtidores(agregar/eliminar o activar/desactivar), se deben poder modificar los precios de los 3 tipos de combustibles para cada región, </w:t>
+      </w:r>
+      <w:r>
+        <w:rPr>
+          <w:rFonts w:ascii="Arial" w:hAnsi="Arial" w:cs="Arial"/>
+        </w:rPr>
+        <w:t xml:space="preserve"> las estaciones y sus respectivos surtidores deben tener códigos con las que se puedan identificar</w:t>
+      </w:r>
+      <w:r>
+        <w:rPr>
+          <w:rFonts w:ascii="Arial" w:hAnsi="Arial" w:cs="Arial"/>
+        </w:rPr>
+        <w:t>.</w:t>
+      </w:r>
+    </w:p>
+    <w:p>
+      <w:pPr>
+        <w:spacing w:line="360" w:lineRule="auto"/>
+        <w:jc w:val="center"/>
+        <w:rPr>
+          <w:rFonts w:ascii="Arial" w:hAnsi="Arial" w:cs="Arial"/>
           <w:sz w:val="32"/>
           <w:szCs w:val="32"/>
         </w:rPr>
-        <w:t>10</w:t>
-      </w:r>
-      <w:r>
-        <w:rPr>
-          <w:rFonts w:ascii="Times New Roman" w:hAnsi="Times New Roman" w:cs="Times New Roman"/>
-          <w:sz w:val="32"/>
-          <w:szCs w:val="32"/>
-        </w:rPr>
-        <w:t>/2024.</w:t>
-      </w:r>
-    </w:p>
-    <w:p>
-      <w:pPr>
-        <w:spacing w:line="360" w:lineRule="auto"/>
-        <w:jc w:val="center"/>
-        <w:rPr>
-          <w:rFonts w:ascii="Times New Roman" w:hAnsi="Times New Roman" w:cs="Times New Roman"/>
-          <w:sz w:val="32"/>
-          <w:szCs w:val="32"/>
-        </w:rPr>
-      </w:pPr>
-      <w:r>
-        <w:rPr>
-          <w:rFonts w:ascii="Times New Roman" w:hAnsi="Times New Roman" w:cs="Times New Roman"/>
-          <w:sz w:val="32"/>
-          <w:szCs w:val="32"/>
-        </w:rPr>
-        <w:lastRenderedPageBreak/>
-        <w:t>Análisis del problema</w:t>
-      </w:r>
-    </w:p>
-    <w:p>
-      <w:pPr>
-        <w:spacing w:line="360" w:lineRule="auto"/>
-        <w:rPr>
-          <w:rFonts w:ascii="Times New Roman" w:hAnsi="Times New Roman" w:cs="Times New Roman"/>
-        </w:rPr>
-      </w:pPr>
-      <w:r>
-        <w:rPr>
-          <w:rFonts w:ascii="Times New Roman" w:hAnsi="Times New Roman" w:cs="Times New Roman"/>
-        </w:rPr>
-        <w:t xml:space="preserve">De manera resumida el problema planteado </w:t>
-      </w:r>
-      <w:r>
-        <w:rPr>
-          <w:rFonts w:ascii="Times New Roman" w:hAnsi="Times New Roman" w:cs="Times New Roman"/>
-        </w:rPr>
-        <w:t>consistiría en encontrar una manera de generar estaciones de servicio</w:t>
-      </w:r>
-      <w:r>
-        <w:rPr>
-          <w:rFonts w:ascii="Times New Roman" w:hAnsi="Times New Roman" w:cs="Times New Roman"/>
-        </w:rPr>
-        <w:t xml:space="preserve"> con (2-12) surtidores que sean capaces de realizar ventas de 3 tipos de combustibles diferentes, cada estación de servicio puede corresponder a una región(norte, central, sur), cada estación debe ser capaz de mostrar el historial de ventas de cada uno de sus surtidores, la cantidad de litros de cada tipo de combustible vendidos en total en la estación y llevar control sobre sus surtidores(agregar/eliminar o activar/desactivar)</w:t>
-      </w:r>
-      <w:r>
-        <w:rPr>
-          <w:rFonts w:ascii="Times New Roman" w:hAnsi="Times New Roman" w:cs="Times New Roman"/>
-        </w:rPr>
-        <w:t xml:space="preserve">, se deben poder modificar los precios de los 3 tipos de combustibles para cada región, </w:t>
-      </w:r>
-      <w:r>
-        <w:rPr>
-          <w:rFonts w:ascii="Times New Roman" w:hAnsi="Times New Roman" w:cs="Times New Roman"/>
-        </w:rPr>
-        <w:t xml:space="preserve"> las estaciones y sus respectivos surtidores deben tener códigos con las que se puedan identificar.</w:t>
-      </w:r>
-    </w:p>
-    <w:p>
-      <w:pPr>
-        <w:spacing w:line="360" w:lineRule="auto"/>
-        <w:jc w:val="center"/>
-        <w:rPr>
-          <w:rFonts w:ascii="Times New Roman" w:hAnsi="Times New Roman" w:cs="Times New Roman"/>
-          <w:sz w:val="32"/>
-          <w:szCs w:val="32"/>
-        </w:rPr>
-      </w:pPr>
-      <w:r>
-        <w:rPr>
-          <w:rFonts w:ascii="Times New Roman" w:hAnsi="Times New Roman" w:cs="Times New Roman"/>
+      </w:pPr>
+      <w:r>
+        <w:rPr>
+          <w:rFonts w:ascii="Arial" w:hAnsi="Arial" w:cs="Arial"/>
           <w:sz w:val="32"/>
           <w:szCs w:val="32"/>
         </w:rPr>
@@ -373,24 +325,27 @@
         <w:tblLook w:val="04A0" w:firstRow="1" w:lastRow="0" w:firstColumn="1" w:lastColumn="0" w:noHBand="0" w:noVBand="1"/>
       </w:tblPr>
       <w:tblGrid>
-        <w:gridCol w:w="5382"/>
+        <w:gridCol w:w="5301"/>
       </w:tblGrid>
       <w:tr>
+        <w:trPr>
+          <w:trHeight w:val="281"/>
+        </w:trPr>
         <w:tc>
           <w:tcPr>
-            <w:tcW w:w="5382" w:type="dxa"/>
+            <w:tcW w:w="5301" w:type="dxa"/>
           </w:tcPr>
           <w:p>
             <w:pPr>
               <w:spacing w:line="360" w:lineRule="auto"/>
               <w:jc w:val="center"/>
               <w:rPr>
-                <w:rFonts w:ascii="Times New Roman" w:hAnsi="Times New Roman" w:cs="Times New Roman"/>
+                <w:rFonts w:ascii="Arial" w:hAnsi="Arial" w:cs="Arial"/>
               </w:rPr>
             </w:pPr>
             <w:r>
               <w:rPr>
-                <w:rFonts w:ascii="Times New Roman" w:hAnsi="Times New Roman" w:cs="Times New Roman"/>
+                <w:rFonts w:ascii="Arial" w:hAnsi="Arial" w:cs="Arial"/>
               </w:rPr>
               <w:t>E_S</w:t>
             </w:r>
@@ -398,21 +353,24 @@
         </w:tc>
       </w:tr>
       <w:tr>
+        <w:trPr>
+          <w:trHeight w:val="1712"/>
+        </w:trPr>
         <w:tc>
           <w:tcPr>
-            <w:tcW w:w="5382" w:type="dxa"/>
+            <w:tcW w:w="5301" w:type="dxa"/>
           </w:tcPr>
           <w:p>
             <w:pPr>
               <w:spacing w:line="360" w:lineRule="auto"/>
               <w:rPr>
-                <w:rFonts w:ascii="Times New Roman" w:hAnsi="Times New Roman" w:cs="Times New Roman"/>
+                <w:rFonts w:ascii="Arial" w:hAnsi="Arial" w:cs="Arial"/>
                 <w:lang w:val="en-US"/>
               </w:rPr>
             </w:pPr>
             <w:r>
               <w:rPr>
-                <w:rFonts w:ascii="Times New Roman" w:hAnsi="Times New Roman" w:cs="Times New Roman"/>
+                <w:rFonts w:ascii="Arial" w:hAnsi="Arial" w:cs="Arial"/>
                 <w:lang w:val="en-US"/>
               </w:rPr>
               <w:t xml:space="preserve">-string </w:t>
@@ -420,7 +378,7 @@
             <w:proofErr w:type="spellStart"/>
             <w:r>
               <w:rPr>
-                <w:rFonts w:ascii="Times New Roman" w:hAnsi="Times New Roman" w:cs="Times New Roman"/>
+                <w:rFonts w:ascii="Arial" w:hAnsi="Arial" w:cs="Arial"/>
                 <w:lang w:val="en-US"/>
               </w:rPr>
               <w:t>nombre</w:t>
@@ -431,51 +389,37 @@
             <w:pPr>
               <w:spacing w:line="360" w:lineRule="auto"/>
               <w:rPr>
-                <w:rFonts w:ascii="Times New Roman" w:hAnsi="Times New Roman" w:cs="Times New Roman"/>
+                <w:rFonts w:ascii="Arial" w:hAnsi="Arial" w:cs="Arial"/>
                 <w:lang w:val="en-US"/>
               </w:rPr>
             </w:pPr>
             <w:r>
               <w:rPr>
-                <w:rFonts w:ascii="Times New Roman" w:hAnsi="Times New Roman" w:cs="Times New Roman"/>
-                <w:lang w:val="en-US"/>
-              </w:rPr>
-              <w:t>-string regi</w:t>
-            </w:r>
-            <w:r>
-              <w:rPr>
-                <w:rFonts w:ascii="Times New Roman" w:hAnsi="Times New Roman" w:cs="Times New Roman"/>
-                <w:lang w:val="en-US"/>
-              </w:rPr>
-              <w:t>on</w:t>
+                <w:rFonts w:ascii="Arial" w:hAnsi="Arial" w:cs="Arial"/>
+                <w:lang w:val="en-US"/>
+              </w:rPr>
+              <w:t>-string region</w:t>
             </w:r>
           </w:p>
           <w:p>
             <w:pPr>
               <w:spacing w:line="360" w:lineRule="auto"/>
               <w:rPr>
-                <w:rFonts w:ascii="Times New Roman" w:hAnsi="Times New Roman" w:cs="Times New Roman"/>
+                <w:rFonts w:ascii="Arial" w:hAnsi="Arial" w:cs="Arial"/>
                 <w:lang w:val="en-US"/>
               </w:rPr>
             </w:pPr>
             <w:r>
               <w:rPr>
-                <w:rFonts w:ascii="Times New Roman" w:hAnsi="Times New Roman" w:cs="Times New Roman"/>
-                <w:lang w:val="en-US"/>
-              </w:rPr>
-              <w:t>-string</w:t>
-            </w:r>
-            <w:r>
-              <w:rPr>
-                <w:rFonts w:ascii="Times New Roman" w:hAnsi="Times New Roman" w:cs="Times New Roman"/>
-                <w:lang w:val="en-US"/>
-              </w:rPr>
-              <w:t xml:space="preserve"> </w:t>
+                <w:rFonts w:ascii="Arial" w:hAnsi="Arial" w:cs="Arial"/>
+                <w:lang w:val="en-US"/>
+              </w:rPr>
+              <w:t xml:space="preserve">-string </w:t>
             </w:r>
             <w:proofErr w:type="spellStart"/>
             <w:r>
               <w:rPr>
-                <w:rFonts w:ascii="Times New Roman" w:hAnsi="Times New Roman" w:cs="Times New Roman"/>
+                <w:rFonts w:ascii="Arial" w:hAnsi="Arial" w:cs="Arial"/>
                 <w:lang w:val="en-US"/>
               </w:rPr>
               <w:t>identificador</w:t>
@@ -486,28 +430,21 @@
             <w:pPr>
               <w:spacing w:line="360" w:lineRule="auto"/>
               <w:rPr>
-                <w:rFonts w:ascii="Times New Roman" w:hAnsi="Times New Roman" w:cs="Times New Roman"/>
+                <w:rFonts w:ascii="Arial" w:hAnsi="Arial" w:cs="Arial"/>
                 <w:lang w:val="en-US"/>
               </w:rPr>
             </w:pPr>
             <w:r>
               <w:rPr>
-                <w:rFonts w:ascii="Times New Roman" w:hAnsi="Times New Roman" w:cs="Times New Roman"/>
-                <w:lang w:val="en-US"/>
-              </w:rPr>
-              <w:t>-int</w:t>
-            </w:r>
-            <w:r>
-              <w:rPr>
-                <w:rFonts w:ascii="Times New Roman" w:hAnsi="Times New Roman" w:cs="Times New Roman"/>
-                <w:lang w:val="en-US"/>
-              </w:rPr>
-              <w:t xml:space="preserve"> </w:t>
+                <w:rFonts w:ascii="Arial" w:hAnsi="Arial" w:cs="Arial"/>
+                <w:lang w:val="en-US"/>
+              </w:rPr>
+              <w:t xml:space="preserve">-int </w:t>
             </w:r>
             <w:proofErr w:type="spellStart"/>
             <w:r>
               <w:rPr>
-                <w:rFonts w:ascii="Times New Roman" w:hAnsi="Times New Roman" w:cs="Times New Roman"/>
+                <w:rFonts w:ascii="Arial" w:hAnsi="Arial" w:cs="Arial"/>
                 <w:lang w:val="en-US"/>
               </w:rPr>
               <w:t>surtidores</w:t>
@@ -518,29 +455,21 @@
             <w:pPr>
               <w:spacing w:line="360" w:lineRule="auto"/>
               <w:rPr>
-                <w:rFonts w:ascii="Times New Roman" w:hAnsi="Times New Roman" w:cs="Times New Roman"/>
+                <w:rFonts w:ascii="Arial" w:hAnsi="Arial" w:cs="Arial"/>
                 <w:lang w:val="en-US"/>
               </w:rPr>
             </w:pPr>
             <w:r>
               <w:rPr>
-                <w:rFonts w:ascii="Times New Roman" w:hAnsi="Times New Roman" w:cs="Times New Roman"/>
-                <w:lang w:val="en-US"/>
-              </w:rPr>
-              <w:t>-int</w:t>
-            </w:r>
-            <w:r>
-              <w:rPr>
-                <w:rFonts w:ascii="Times New Roman" w:hAnsi="Times New Roman" w:cs="Times New Roman"/>
-                <w:lang w:val="en-US"/>
-              </w:rPr>
-              <w:t xml:space="preserve"> </w:t>
+                <w:rFonts w:ascii="Arial" w:hAnsi="Arial" w:cs="Arial"/>
+                <w:lang w:val="en-US"/>
+              </w:rPr>
+              <w:t xml:space="preserve">-int </w:t>
             </w:r>
             <w:proofErr w:type="spellStart"/>
-            <w:proofErr w:type="gramStart"/>
-            <w:r>
-              <w:rPr>
-                <w:rFonts w:ascii="Times New Roman" w:hAnsi="Times New Roman" w:cs="Times New Roman"/>
+            <w:r>
+              <w:rPr>
+                <w:rFonts w:ascii="Arial" w:hAnsi="Arial" w:cs="Arial"/>
                 <w:lang w:val="en-US"/>
               </w:rPr>
               <w:t>captanque</w:t>
@@ -548,47 +477,31 @@
             <w:proofErr w:type="spellEnd"/>
             <w:r>
               <w:rPr>
-                <w:rFonts w:ascii="Times New Roman" w:hAnsi="Times New Roman" w:cs="Times New Roman"/>
-                <w:lang w:val="en-US"/>
-              </w:rPr>
-              <w:t>[</w:t>
-            </w:r>
-            <w:proofErr w:type="gramEnd"/>
-            <w:r>
-              <w:rPr>
-                <w:rFonts w:ascii="Times New Roman" w:hAnsi="Times New Roman" w:cs="Times New Roman"/>
-                <w:lang w:val="en-US"/>
-              </w:rPr>
-              <w:t>3]</w:t>
+                <w:rFonts w:ascii="Arial" w:hAnsi="Arial" w:cs="Arial"/>
+                <w:lang w:val="en-US"/>
+              </w:rPr>
+              <w:t>[3]</w:t>
             </w:r>
           </w:p>
           <w:p>
             <w:pPr>
               <w:spacing w:line="360" w:lineRule="auto"/>
               <w:rPr>
-                <w:rFonts w:ascii="Times New Roman" w:hAnsi="Times New Roman" w:cs="Times New Roman"/>
+                <w:rFonts w:ascii="Arial" w:hAnsi="Arial" w:cs="Arial"/>
                 <w:lang w:val="en-US"/>
               </w:rPr>
             </w:pPr>
             <w:r>
               <w:rPr>
-                <w:rFonts w:ascii="Times New Roman" w:hAnsi="Times New Roman" w:cs="Times New Roman"/>
-                <w:lang w:val="en-US"/>
-              </w:rPr>
-              <w:t>-int</w:t>
-            </w:r>
-            <w:r>
-              <w:rPr>
-                <w:rFonts w:ascii="Times New Roman" w:hAnsi="Times New Roman" w:cs="Times New Roman"/>
-                <w:lang w:val="en-US"/>
-              </w:rPr>
-              <w:t xml:space="preserve"> </w:t>
+                <w:rFonts w:ascii="Arial" w:hAnsi="Arial" w:cs="Arial"/>
+                <w:lang w:val="en-US"/>
+              </w:rPr>
+              <w:t xml:space="preserve">-int </w:t>
             </w:r>
             <w:proofErr w:type="spellStart"/>
-            <w:proofErr w:type="gramStart"/>
-            <w:r>
-              <w:rPr>
-                <w:rFonts w:ascii="Times New Roman" w:hAnsi="Times New Roman" w:cs="Times New Roman"/>
+            <w:r>
+              <w:rPr>
+                <w:rFonts w:ascii="Arial" w:hAnsi="Arial" w:cs="Arial"/>
                 <w:lang w:val="en-US"/>
               </w:rPr>
               <w:t>captanoriginal</w:t>
@@ -596,62 +509,41 @@
             <w:proofErr w:type="spellEnd"/>
             <w:r>
               <w:rPr>
-                <w:rFonts w:ascii="Times New Roman" w:hAnsi="Times New Roman" w:cs="Times New Roman"/>
-                <w:lang w:val="en-US"/>
-              </w:rPr>
-              <w:t>[</w:t>
-            </w:r>
-            <w:proofErr w:type="gramEnd"/>
-            <w:r>
-              <w:rPr>
-                <w:rFonts w:ascii="Times New Roman" w:hAnsi="Times New Roman" w:cs="Times New Roman"/>
-                <w:lang w:val="en-US"/>
-              </w:rPr>
-              <w:t>3]</w:t>
+                <w:rFonts w:ascii="Arial" w:hAnsi="Arial" w:cs="Arial"/>
+                <w:lang w:val="en-US"/>
+              </w:rPr>
+              <w:t>[3]</w:t>
             </w:r>
           </w:p>
         </w:tc>
       </w:tr>
       <w:tr>
+        <w:trPr>
+          <w:trHeight w:val="570"/>
+        </w:trPr>
         <w:tc>
           <w:tcPr>
-            <w:tcW w:w="5382" w:type="dxa"/>
+            <w:tcW w:w="5301" w:type="dxa"/>
           </w:tcPr>
           <w:p>
             <w:pPr>
               <w:spacing w:line="360" w:lineRule="auto"/>
               <w:rPr>
-                <w:rFonts w:ascii="Times New Roman" w:hAnsi="Times New Roman" w:cs="Times New Roman"/>
+                <w:rFonts w:ascii="Arial" w:hAnsi="Arial" w:cs="Arial"/>
                 <w:lang w:val="en-US"/>
               </w:rPr>
             </w:pPr>
             <w:r>
               <w:rPr>
-                <w:rFonts w:ascii="Times New Roman" w:hAnsi="Times New Roman" w:cs="Times New Roman"/>
-                <w:lang w:val="en-US"/>
-              </w:rPr>
-              <w:t>+E_</w:t>
-            </w:r>
-            <w:proofErr w:type="gramStart"/>
-            <w:r>
-              <w:rPr>
-                <w:rFonts w:ascii="Times New Roman" w:hAnsi="Times New Roman" w:cs="Times New Roman"/>
-                <w:lang w:val="en-US"/>
-              </w:rPr>
-              <w:t>S(</w:t>
-            </w:r>
-            <w:proofErr w:type="gramEnd"/>
-            <w:r>
-              <w:rPr>
-                <w:rFonts w:ascii="Times New Roman" w:hAnsi="Times New Roman" w:cs="Times New Roman"/>
-                <w:lang w:val="en-US"/>
-              </w:rPr>
-              <w:t>string _</w:t>
+                <w:rFonts w:ascii="Arial" w:hAnsi="Arial" w:cs="Arial"/>
+                <w:lang w:val="en-US"/>
+              </w:rPr>
+              <w:t>+E_S(string _</w:t>
             </w:r>
             <w:proofErr w:type="spellStart"/>
             <w:r>
               <w:rPr>
-                <w:rFonts w:ascii="Times New Roman" w:hAnsi="Times New Roman" w:cs="Times New Roman"/>
+                <w:rFonts w:ascii="Arial" w:hAnsi="Arial" w:cs="Arial"/>
                 <w:lang w:val="en-US"/>
               </w:rPr>
               <w:t>nombre</w:t>
@@ -659,7 +551,7 @@
             <w:proofErr w:type="spellEnd"/>
             <w:r>
               <w:rPr>
-                <w:rFonts w:ascii="Times New Roman" w:hAnsi="Times New Roman" w:cs="Times New Roman"/>
+                <w:rFonts w:ascii="Arial" w:hAnsi="Arial" w:cs="Arial"/>
                 <w:lang w:val="en-US"/>
               </w:rPr>
               <w:t>, string _region, int _</w:t>
@@ -667,7 +559,7 @@
             <w:proofErr w:type="spellStart"/>
             <w:r>
               <w:rPr>
-                <w:rFonts w:ascii="Times New Roman" w:hAnsi="Times New Roman" w:cs="Times New Roman"/>
+                <w:rFonts w:ascii="Arial" w:hAnsi="Arial" w:cs="Arial"/>
                 <w:lang w:val="en-US"/>
               </w:rPr>
               <w:t>surtidores</w:t>
@@ -675,7 +567,7 @@
             <w:proofErr w:type="spellEnd"/>
             <w:r>
               <w:rPr>
-                <w:rFonts w:ascii="Times New Roman" w:hAnsi="Times New Roman" w:cs="Times New Roman"/>
+                <w:rFonts w:ascii="Arial" w:hAnsi="Arial" w:cs="Arial"/>
                 <w:lang w:val="en-US"/>
               </w:rPr>
               <w:t>)</w:t>
@@ -685,32 +577,16 @@
             <w:pPr>
               <w:spacing w:line="360" w:lineRule="auto"/>
               <w:rPr>
-                <w:rFonts w:ascii="Times New Roman" w:hAnsi="Times New Roman" w:cs="Times New Roman"/>
+                <w:rFonts w:ascii="Arial" w:hAnsi="Arial" w:cs="Arial"/>
                 <w:lang w:val="en-US"/>
               </w:rPr>
             </w:pPr>
             <w:r>
               <w:rPr>
-                <w:rFonts w:ascii="Times New Roman" w:hAnsi="Times New Roman" w:cs="Times New Roman"/>
-                <w:lang w:val="en-US"/>
-              </w:rPr>
-              <w:t>+~E_</w:t>
-            </w:r>
-            <w:proofErr w:type="gramStart"/>
-            <w:r>
-              <w:rPr>
-                <w:rFonts w:ascii="Times New Roman" w:hAnsi="Times New Roman" w:cs="Times New Roman"/>
-                <w:lang w:val="en-US"/>
-              </w:rPr>
-              <w:t>S(</w:t>
-            </w:r>
-            <w:proofErr w:type="gramEnd"/>
-            <w:r>
-              <w:rPr>
-                <w:rFonts w:ascii="Times New Roman" w:hAnsi="Times New Roman" w:cs="Times New Roman"/>
-                <w:lang w:val="en-US"/>
-              </w:rPr>
-              <w:t>)</w:t>
+                <w:rFonts w:ascii="Arial" w:hAnsi="Arial" w:cs="Arial"/>
+                <w:lang w:val="en-US"/>
+              </w:rPr>
+              <w:t>+~E_S()</w:t>
             </w:r>
           </w:p>
         </w:tc>
@@ -735,8 +611,14 @@
           <w:p>
             <w:pPr>
               <w:jc w:val="center"/>
+              <w:rPr>
+                <w:rFonts w:ascii="Arial" w:hAnsi="Arial" w:cs="Arial"/>
+              </w:rPr>
             </w:pPr>
             <w:r>
+              <w:rPr>
+                <w:rFonts w:ascii="Arial" w:hAnsi="Arial" w:cs="Arial"/>
+              </w:rPr>
               <w:t>Surtidor</w:t>
             </w:r>
           </w:p>
@@ -750,11 +632,13 @@
           <w:p>
             <w:pPr>
               <w:rPr>
+                <w:rFonts w:ascii="Arial" w:hAnsi="Arial" w:cs="Arial"/>
                 <w:lang w:val="en-US"/>
               </w:rPr>
             </w:pPr>
             <w:r>
               <w:rPr>
+                <w:rFonts w:ascii="Arial" w:hAnsi="Arial" w:cs="Arial"/>
                 <w:lang w:val="en-US"/>
               </w:rPr>
               <w:t xml:space="preserve">-string </w:t>
@@ -762,39 +646,31 @@
             <w:proofErr w:type="spellStart"/>
             <w:r>
               <w:rPr>
-                <w:lang w:val="en-US"/>
-              </w:rPr>
-              <w:t>ide</w:t>
-            </w:r>
-            <w:r>
-              <w:rPr>
-                <w:lang w:val="en-US"/>
-              </w:rPr>
-              <w:t>ntificador</w:t>
+                <w:rFonts w:ascii="Arial" w:hAnsi="Arial" w:cs="Arial"/>
+                <w:lang w:val="en-US"/>
+              </w:rPr>
+              <w:t>identificador</w:t>
             </w:r>
             <w:proofErr w:type="spellEnd"/>
           </w:p>
           <w:p>
             <w:pPr>
               <w:rPr>
+                <w:rFonts w:ascii="Arial" w:hAnsi="Arial" w:cs="Arial"/>
                 <w:lang w:val="en-US"/>
               </w:rPr>
             </w:pPr>
             <w:r>
               <w:rPr>
-                <w:lang w:val="en-US"/>
-              </w:rPr>
-              <w:t>-bool</w:t>
-            </w:r>
-            <w:r>
-              <w:rPr>
-                <w:lang w:val="en-US"/>
-              </w:rPr>
-              <w:t xml:space="preserve"> </w:t>
+                <w:rFonts w:ascii="Arial" w:hAnsi="Arial" w:cs="Arial"/>
+                <w:lang w:val="en-US"/>
+              </w:rPr>
+              <w:t xml:space="preserve">-bool </w:t>
             </w:r>
             <w:proofErr w:type="spellStart"/>
             <w:r>
               <w:rPr>
+                <w:rFonts w:ascii="Arial" w:hAnsi="Arial" w:cs="Arial"/>
                 <w:lang w:val="en-US"/>
               </w:rPr>
               <w:t>activo</w:t>
@@ -804,24 +680,21 @@
           <w:p>
             <w:pPr>
               <w:rPr>
+                <w:rFonts w:ascii="Arial" w:hAnsi="Arial" w:cs="Arial"/>
                 <w:lang w:val="en-US"/>
               </w:rPr>
             </w:pPr>
             <w:r>
               <w:rPr>
-                <w:lang w:val="en-US"/>
-              </w:rPr>
-              <w:t>-int</w:t>
-            </w:r>
-            <w:r>
-              <w:rPr>
-                <w:lang w:val="en-US"/>
-              </w:rPr>
-              <w:t xml:space="preserve"> </w:t>
+                <w:rFonts w:ascii="Arial" w:hAnsi="Arial" w:cs="Arial"/>
+                <w:lang w:val="en-US"/>
+              </w:rPr>
+              <w:t xml:space="preserve">-int </w:t>
             </w:r>
             <w:proofErr w:type="spellStart"/>
             <w:r>
               <w:rPr>
+                <w:rFonts w:ascii="Arial" w:hAnsi="Arial" w:cs="Arial"/>
                 <w:lang w:val="en-US"/>
               </w:rPr>
               <w:t>ventaS</w:t>
@@ -831,25 +704,21 @@
           <w:p>
             <w:pPr>
               <w:rPr>
+                <w:rFonts w:ascii="Arial" w:hAnsi="Arial" w:cs="Arial"/>
                 <w:lang w:val="en-US"/>
               </w:rPr>
             </w:pPr>
             <w:r>
               <w:rPr>
-                <w:lang w:val="en-US"/>
-              </w:rPr>
-              <w:t>-int</w:t>
-            </w:r>
-            <w:r>
-              <w:rPr>
-                <w:lang w:val="en-US"/>
-              </w:rPr>
-              <w:t xml:space="preserve"> </w:t>
+                <w:rFonts w:ascii="Arial" w:hAnsi="Arial" w:cs="Arial"/>
+                <w:lang w:val="en-US"/>
+              </w:rPr>
+              <w:t xml:space="preserve">-int </w:t>
             </w:r>
             <w:proofErr w:type="spellStart"/>
-            <w:proofErr w:type="gramStart"/>
-            <w:r>
-              <w:rPr>
+            <w:r>
+              <w:rPr>
+                <w:rFonts w:ascii="Arial" w:hAnsi="Arial" w:cs="Arial"/>
                 <w:lang w:val="en-US"/>
               </w:rPr>
               <w:t>Litrosvend</w:t>
@@ -857,16 +726,10 @@
             <w:proofErr w:type="spellEnd"/>
             <w:r>
               <w:rPr>
-                <w:lang w:val="en-US"/>
-              </w:rPr>
-              <w:t>[</w:t>
-            </w:r>
-            <w:proofErr w:type="gramEnd"/>
-            <w:r>
-              <w:rPr>
-                <w:lang w:val="en-US"/>
-              </w:rPr>
-              <w:t>3]</w:t>
+                <w:rFonts w:ascii="Arial" w:hAnsi="Arial" w:cs="Arial"/>
+                <w:lang w:val="en-US"/>
+              </w:rPr>
+              <w:t>[3]</w:t>
             </w:r>
           </w:p>
         </w:tc>
@@ -877,42 +740,57 @@
             <w:tcW w:w="4390" w:type="dxa"/>
           </w:tcPr>
           <w:p>
-            <w:r>
-              <w:t>+</w:t>
-            </w:r>
-            <w:proofErr w:type="gramStart"/>
-            <w:r>
-              <w:t>Surtidor(</w:t>
+            <w:pPr>
+              <w:rPr>
+                <w:rFonts w:ascii="Arial" w:hAnsi="Arial" w:cs="Arial"/>
+              </w:rPr>
+            </w:pPr>
+            <w:r>
+              <w:rPr>
+                <w:rFonts w:ascii="Arial" w:hAnsi="Arial" w:cs="Arial"/>
+              </w:rPr>
+              <w:t>+Surtidor(</w:t>
             </w:r>
             <w:proofErr w:type="spellStart"/>
-            <w:proofErr w:type="gramEnd"/>
-            <w:r>
+            <w:r>
+              <w:rPr>
+                <w:rFonts w:ascii="Arial" w:hAnsi="Arial" w:cs="Arial"/>
+              </w:rPr>
               <w:t>int</w:t>
             </w:r>
             <w:proofErr w:type="spellEnd"/>
             <w:r>
+              <w:rPr>
+                <w:rFonts w:ascii="Arial" w:hAnsi="Arial" w:cs="Arial"/>
+              </w:rPr>
               <w:t xml:space="preserve"> </w:t>
             </w:r>
             <w:proofErr w:type="spellStart"/>
             <w:r>
+              <w:rPr>
+                <w:rFonts w:ascii="Arial" w:hAnsi="Arial" w:cs="Arial"/>
+              </w:rPr>
               <w:t>ID_ES,string</w:t>
             </w:r>
             <w:proofErr w:type="spellEnd"/>
             <w:r>
+              <w:rPr>
+                <w:rFonts w:ascii="Arial" w:hAnsi="Arial" w:cs="Arial"/>
+              </w:rPr>
               <w:t xml:space="preserve"> _identificador)</w:t>
             </w:r>
           </w:p>
           <w:p>
-            <w:r>
-              <w:t>+~</w:t>
-            </w:r>
-            <w:proofErr w:type="gramStart"/>
-            <w:r>
-              <w:t>Surtidor(</w:t>
-            </w:r>
-            <w:proofErr w:type="gramEnd"/>
-            <w:r>
-              <w:t>)</w:t>
+            <w:pPr>
+              <w:rPr>
+                <w:rFonts w:ascii="Arial" w:hAnsi="Arial" w:cs="Arial"/>
+              </w:rPr>
+            </w:pPr>
+            <w:r>
+              <w:rPr>
+                <w:rFonts w:ascii="Arial" w:hAnsi="Arial" w:cs="Arial"/>
+              </w:rPr>
+              <w:t>+~Surtidor()</w:t>
             </w:r>
           </w:p>
         </w:tc>
@@ -922,68 +800,154 @@
       <w:pPr>
         <w:spacing w:line="360" w:lineRule="auto"/>
         <w:rPr>
-          <w:rFonts w:ascii="Times New Roman" w:hAnsi="Times New Roman" w:cs="Times New Roman"/>
-        </w:rPr>
-      </w:pPr>
-      <w:r>
-        <w:rPr>
-          <w:rFonts w:ascii="Times New Roman" w:hAnsi="Times New Roman" w:cs="Times New Roman"/>
-        </w:rPr>
-        <w:t>Para solucionar este problema he decidido implementar 2 clases llamadas E_</w:t>
-      </w:r>
-      <w:proofErr w:type="gramStart"/>
-      <w:r>
-        <w:rPr>
-          <w:rFonts w:ascii="Times New Roman" w:hAnsi="Times New Roman" w:cs="Times New Roman"/>
-        </w:rPr>
-        <w:t>S(</w:t>
-      </w:r>
-      <w:proofErr w:type="gramEnd"/>
-      <w:r>
-        <w:rPr>
-          <w:rFonts w:ascii="Times New Roman" w:hAnsi="Times New Roman" w:cs="Times New Roman"/>
-        </w:rPr>
-        <w:t xml:space="preserve">para estaciones de servicio) y Surtidor(para los surtidores), diversas funciones que actúen como menú para acceder a las diferentes funciones necesarias del programa (como pueden ser el simulador de ventas, agregar o eliminar surtidores o estaciones y asignarles una región y código, </w:t>
+          <w:rFonts w:ascii="Arial" w:hAnsi="Arial" w:cs="Arial"/>
+        </w:rPr>
+      </w:pPr>
+      <w:r>
+        <w:rPr>
+          <w:rFonts w:ascii="Arial" w:hAnsi="Arial" w:cs="Arial"/>
+        </w:rPr>
+        <w:t xml:space="preserve">Para solucionar este problema he decidido implementar 2 clases llamadas E_S(para estaciones de servicio) y Surtidor(para los surtidores), diversas funciones que actúen como menú para acceder a las diferentes funciones necesarias del programa (como pueden ser el simulador de ventas, agregar o eliminar surtidores o estaciones y asignarles una región y código, </w:t>
       </w:r>
       <w:proofErr w:type="spellStart"/>
       <w:r>
         <w:rPr>
-          <w:rFonts w:ascii="Times New Roman" w:hAnsi="Times New Roman" w:cs="Times New Roman"/>
+          <w:rFonts w:ascii="Arial" w:hAnsi="Arial" w:cs="Arial"/>
         </w:rPr>
         <w:t>etc</w:t>
       </w:r>
       <w:proofErr w:type="spellEnd"/>
       <w:r>
         <w:rPr>
-          <w:rFonts w:ascii="Times New Roman" w:hAnsi="Times New Roman" w:cs="Times New Roman"/>
+          <w:rFonts w:ascii="Arial" w:hAnsi="Arial" w:cs="Arial"/>
         </w:rPr>
         <w:t>) y variables, arreglos y matrices para llevar un mejor control de todo el programa.</w:t>
       </w:r>
     </w:p>
     <w:p>
       <w:pPr>
-        <w:spacing w:line="360" w:lineRule="auto"/>
-        <w:rPr>
-          <w:rFonts w:ascii="Times New Roman" w:hAnsi="Times New Roman" w:cs="Times New Roman"/>
-        </w:rPr>
-      </w:pPr>
-    </w:p>
-    <w:p>
-      <w:r>
-        <w:rPr>
-          <w:rFonts w:ascii="Times New Roman" w:hAnsi="Times New Roman" w:cs="Times New Roman"/>
+        <w:spacing w:line="259" w:lineRule="auto"/>
+        <w:rPr>
+          <w:rFonts w:ascii="Arial" w:hAnsi="Arial" w:cs="Arial"/>
+        </w:rPr>
+      </w:pPr>
+      <w:r>
+        <w:rPr>
+          <w:rFonts w:ascii="Arial" w:hAnsi="Arial" w:cs="Arial"/>
           <w:noProof/>
         </w:rPr>
         <mc:AlternateContent>
           <mc:Choice Requires="wps">
             <w:drawing>
-              <wp:anchor distT="45720" distB="45720" distL="114300" distR="114300" simplePos="0" relativeHeight="251664384" behindDoc="1" locked="0" layoutInCell="1" allowOverlap="1" wp14:anchorId="24835570" wp14:editId="11796395">
+              <wp:anchor distT="45720" distB="45720" distL="114300" distR="114300" simplePos="0" relativeHeight="251662336" behindDoc="0" locked="0" layoutInCell="1" allowOverlap="1" wp14:anchorId="70001985" wp14:editId="31BFBD84">
                 <wp:simplePos x="0" y="0"/>
                 <wp:positionH relativeFrom="column">
-                  <wp:posOffset>2914015</wp:posOffset>
+                  <wp:posOffset>2456815</wp:posOffset>
                 </wp:positionH>
                 <wp:positionV relativeFrom="paragraph">
-                  <wp:posOffset>54610</wp:posOffset>
+                  <wp:posOffset>798195</wp:posOffset>
+                </wp:positionV>
+                <wp:extent cx="260350" cy="266700"/>
+                <wp:effectExtent l="0" t="0" r="0" b="0"/>
+                <wp:wrapSquare wrapText="bothSides"/>
+                <wp:docPr id="217" name="Cuadro de texto 2"/>
+                <wp:cNvGraphicFramePr>
+                  <a:graphicFrameLocks xmlns:a="http://schemas.openxmlformats.org/drawingml/2006/main"/>
+                </wp:cNvGraphicFramePr>
+                <a:graphic xmlns:a="http://schemas.openxmlformats.org/drawingml/2006/main">
+                  <a:graphicData uri="http://schemas.microsoft.com/office/word/2010/wordprocessingShape">
+                    <wps:wsp>
+                      <wps:cNvSpPr txBox="1">
+                        <a:spLocks noChangeArrowheads="1"/>
+                      </wps:cNvSpPr>
+                      <wps:spPr bwMode="auto">
+                        <a:xfrm>
+                          <a:off x="0" y="0"/>
+                          <a:ext cx="260350" cy="266700"/>
+                        </a:xfrm>
+                        <a:prstGeom prst="rect">
+                          <a:avLst/>
+                        </a:prstGeom>
+                        <a:noFill/>
+                        <a:ln>
+                          <a:noFill/>
+                        </a:ln>
+                      </wps:spPr>
+                      <wps:style>
+                        <a:lnRef idx="0">
+                          <a:scrgbClr r="0" g="0" b="0"/>
+                        </a:lnRef>
+                        <a:fillRef idx="0">
+                          <a:scrgbClr r="0" g="0" b="0"/>
+                        </a:fillRef>
+                        <a:effectRef idx="0">
+                          <a:scrgbClr r="0" g="0" b="0"/>
+                        </a:effectRef>
+                        <a:fontRef idx="minor">
+                          <a:schemeClr val="dk1"/>
+                        </a:fontRef>
+                      </wps:style>
+                      <wps:txbx>
+                        <w:txbxContent>
+                          <w:p>
+                            <w:r>
+                              <w:t>1</w:t>
+                            </w:r>
+                          </w:p>
+                        </w:txbxContent>
+                      </wps:txbx>
+                      <wps:bodyPr rot="0" vert="horz" wrap="square" lIns="91440" tIns="45720" rIns="91440" bIns="45720" anchor="t" anchorCtr="0">
+                        <a:noAutofit/>
+                      </wps:bodyPr>
+                    </wps:wsp>
+                  </a:graphicData>
+                </a:graphic>
+                <wp14:sizeRelH relativeFrom="margin">
+                  <wp14:pctWidth>0</wp14:pctWidth>
+                </wp14:sizeRelH>
+                <wp14:sizeRelV relativeFrom="margin">
+                  <wp14:pctHeight>0</wp14:pctHeight>
+                </wp14:sizeRelV>
+              </wp:anchor>
+            </w:drawing>
+          </mc:Choice>
+          <mc:Fallback>
+            <w:pict>
+              <v:shapetype w14:anchorId="70001985" id="_x0000_t202" coordsize="21600,21600" o:spt="202" path="m,l,21600r21600,l21600,xe">
+                <v:stroke joinstyle="miter"/>
+                <v:path gradientshapeok="t" o:connecttype="rect"/>
+              </v:shapetype>
+              <v:shape id="Cuadro de texto 2" o:spid="_x0000_s1026" type="#_x0000_t202" style="position:absolute;margin-left:193.45pt;margin-top:62.85pt;width:20.5pt;height:21pt;z-index:251662336;visibility:visible;mso-wrap-style:square;mso-width-percent:0;mso-height-percent:0;mso-wrap-distance-left:9pt;mso-wrap-distance-top:3.6pt;mso-wrap-distance-right:9pt;mso-wrap-distance-bottom:3.6pt;mso-position-horizontal:absolute;mso-position-horizontal-relative:text;mso-position-vertical:absolute;mso-position-vertical-relative:text;mso-width-percent:0;mso-height-percent:0;mso-width-relative:margin;mso-height-relative:margin;v-text-anchor:top" o:gfxdata="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" filled="f" stroked="f">
+                <v:textbox>
+                  <w:txbxContent>
+                    <w:p>
+                      <w:r>
+                        <w:t>1</w:t>
+                      </w:r>
+                    </w:p>
+                  </w:txbxContent>
+                </v:textbox>
+                <w10:wrap type="square"/>
+              </v:shape>
+            </w:pict>
+          </mc:Fallback>
+        </mc:AlternateContent>
+      </w:r>
+      <w:r>
+        <w:rPr>
+          <w:rFonts w:ascii="Arial" w:hAnsi="Arial" w:cs="Arial"/>
+          <w:noProof/>
+        </w:rPr>
+        <mc:AlternateContent>
+          <mc:Choice Requires="wps">
+            <w:drawing>
+              <wp:anchor distT="45720" distB="45720" distL="114300" distR="114300" simplePos="0" relativeHeight="251664384" behindDoc="1" locked="0" layoutInCell="1" allowOverlap="1" wp14:anchorId="24835570" wp14:editId="7A3EB4AC">
+                <wp:simplePos x="0" y="0"/>
+                <wp:positionH relativeFrom="column">
+                  <wp:posOffset>2894965</wp:posOffset>
+                </wp:positionH>
+                <wp:positionV relativeFrom="paragraph">
+                  <wp:posOffset>423545</wp:posOffset>
                 </wp:positionV>
                 <wp:extent cx="304800" cy="311150"/>
                 <wp:effectExtent l="0" t="0" r="0" b="0"/>
@@ -1051,11 +1015,7 @@
           </mc:Choice>
           <mc:Fallback>
             <w:pict>
-              <v:shapetype w14:anchorId="24835570" id="_x0000_t202" coordsize="21600,21600" o:spt="202" path="m,l,21600r21600,l21600,xe">
-                <v:stroke joinstyle="miter"/>
-                <v:path gradientshapeok="t" o:connecttype="rect"/>
-              </v:shapetype>
-              <v:shape id="Cuadro de texto 2" o:spid="_x0000_s1026" type="#_x0000_t202" style="position:absolute;margin-left:229.45pt;margin-top:4.3pt;width:24pt;height:24.5pt;z-index:-251652096;visibility:visible;mso-wrap-style:square;mso-width-percent:0;mso-height-percent:0;mso-wrap-distance-left:9pt;mso-wrap-distance-top:3.6pt;mso-wrap-distance-right:9pt;mso-wrap-distance-bottom:3.6pt;mso-position-horizontal:absolute;mso-position-horizontal-relative:text;mso-position-vertical:absolute;mso-position-vertical-relative:text;mso-width-percent:0;mso-height-percent:0;mso-width-relative:margin;mso-height-relative:margin;v-text-anchor:top" o:gfxdata="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" filled="f" stroked="f">
+              <v:shape w14:anchorId="24835570" id="_x0000_s1027" type="#_x0000_t202" style="position:absolute;margin-left:227.95pt;margin-top:33.35pt;width:24pt;height:24.5pt;z-index:-251652096;visibility:visible;mso-wrap-style:square;mso-width-percent:0;mso-height-percent:0;mso-wrap-distance-left:9pt;mso-wrap-distance-top:3.6pt;mso-wrap-distance-right:9pt;mso-wrap-distance-bottom:3.6pt;mso-position-horizontal:absolute;mso-position-horizontal-relative:text;mso-position-vertical:absolute;mso-position-vertical-relative:text;mso-width-percent:0;mso-height-percent:0;mso-width-relative:margin;mso-height-relative:margin;v-text-anchor:top" o:gfxdata="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" filled="f" stroked="f">
                 <v:textbox>
                   <w:txbxContent>
                     <w:p>
@@ -1072,115 +1032,19 @@
       </w:r>
       <w:r>
         <w:rPr>
+          <w:rFonts w:ascii="Arial" w:hAnsi="Arial" w:cs="Arial"/>
           <w:noProof/>
         </w:rPr>
         <mc:AlternateContent>
           <mc:Choice Requires="wps">
             <w:drawing>
-              <wp:anchor distT="45720" distB="45720" distL="114300" distR="114300" simplePos="0" relativeHeight="251662336" behindDoc="0" locked="0" layoutInCell="1" allowOverlap="1" wp14:anchorId="70001985" wp14:editId="017FD391">
+              <wp:anchor distT="0" distB="0" distL="114300" distR="114300" simplePos="0" relativeHeight="251660288" behindDoc="0" locked="0" layoutInCell="1" allowOverlap="1" wp14:anchorId="16878909" wp14:editId="76421C79">
                 <wp:simplePos x="0" y="0"/>
                 <wp:positionH relativeFrom="column">
-                  <wp:posOffset>2475865</wp:posOffset>
+                  <wp:posOffset>2488565</wp:posOffset>
                 </wp:positionH>
                 <wp:positionV relativeFrom="paragraph">
-                  <wp:posOffset>327660</wp:posOffset>
-                </wp:positionV>
-                <wp:extent cx="260350" cy="266700"/>
-                <wp:effectExtent l="0" t="0" r="0" b="0"/>
-                <wp:wrapSquare wrapText="bothSides"/>
-                <wp:docPr id="217" name="Cuadro de texto 2"/>
-                <wp:cNvGraphicFramePr>
-                  <a:graphicFrameLocks xmlns:a="http://schemas.openxmlformats.org/drawingml/2006/main"/>
-                </wp:cNvGraphicFramePr>
-                <a:graphic xmlns:a="http://schemas.openxmlformats.org/drawingml/2006/main">
-                  <a:graphicData uri="http://schemas.microsoft.com/office/word/2010/wordprocessingShape">
-                    <wps:wsp>
-                      <wps:cNvSpPr txBox="1">
-                        <a:spLocks noChangeArrowheads="1"/>
-                      </wps:cNvSpPr>
-                      <wps:spPr bwMode="auto">
-                        <a:xfrm>
-                          <a:off x="0" y="0"/>
-                          <a:ext cx="260350" cy="266700"/>
-                        </a:xfrm>
-                        <a:prstGeom prst="rect">
-                          <a:avLst/>
-                        </a:prstGeom>
-                        <a:noFill/>
-                        <a:ln>
-                          <a:noFill/>
-                        </a:ln>
-                      </wps:spPr>
-                      <wps:style>
-                        <a:lnRef idx="0">
-                          <a:scrgbClr r="0" g="0" b="0"/>
-                        </a:lnRef>
-                        <a:fillRef idx="0">
-                          <a:scrgbClr r="0" g="0" b="0"/>
-                        </a:fillRef>
-                        <a:effectRef idx="0">
-                          <a:scrgbClr r="0" g="0" b="0"/>
-                        </a:effectRef>
-                        <a:fontRef idx="minor">
-                          <a:schemeClr val="dk1"/>
-                        </a:fontRef>
-                      </wps:style>
-                      <wps:txbx>
-                        <w:txbxContent>
-                          <w:p>
-                            <w:r>
-                              <w:t>1</w:t>
-                            </w:r>
-                          </w:p>
-                        </w:txbxContent>
-                      </wps:txbx>
-                      <wps:bodyPr rot="0" vert="horz" wrap="square" lIns="91440" tIns="45720" rIns="91440" bIns="45720" anchor="t" anchorCtr="0">
-                        <a:noAutofit/>
-                      </wps:bodyPr>
-                    </wps:wsp>
-                  </a:graphicData>
-                </a:graphic>
-                <wp14:sizeRelH relativeFrom="margin">
-                  <wp14:pctWidth>0</wp14:pctWidth>
-                </wp14:sizeRelH>
-                <wp14:sizeRelV relativeFrom="margin">
-                  <wp14:pctHeight>0</wp14:pctHeight>
-                </wp14:sizeRelV>
-              </wp:anchor>
-            </w:drawing>
-          </mc:Choice>
-          <mc:Fallback>
-            <w:pict>
-              <v:shape w14:anchorId="70001985" id="_x0000_s1027" type="#_x0000_t202" style="position:absolute;margin-left:194.95pt;margin-top:25.8pt;width:20.5pt;height:21pt;z-index:251662336;visibility:visible;mso-wrap-style:square;mso-width-percent:0;mso-height-percent:0;mso-wrap-distance-left:9pt;mso-wrap-distance-top:3.6pt;mso-wrap-distance-right:9pt;mso-wrap-distance-bottom:3.6pt;mso-position-horizontal:absolute;mso-position-horizontal-relative:text;mso-position-vertical:absolute;mso-position-vertical-relative:text;mso-width-percent:0;mso-height-percent:0;mso-width-relative:margin;mso-height-relative:margin;v-text-anchor:top" o:gfxdata="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" filled="f" stroked="f">
-                <v:textbox>
-                  <w:txbxContent>
-                    <w:p>
-                      <w:r>
-                        <w:t>1</w:t>
-                      </w:r>
-                    </w:p>
-                  </w:txbxContent>
-                </v:textbox>
-                <w10:wrap type="square"/>
-              </v:shape>
-            </w:pict>
-          </mc:Fallback>
-        </mc:AlternateContent>
-      </w:r>
-      <w:r>
-        <w:rPr>
-          <w:noProof/>
-        </w:rPr>
-        <mc:AlternateContent>
-          <mc:Choice Requires="wps">
-            <w:drawing>
-              <wp:anchor distT="0" distB="0" distL="114300" distR="114300" simplePos="0" relativeHeight="251660288" behindDoc="0" locked="0" layoutInCell="1" allowOverlap="1" wp14:anchorId="16878909" wp14:editId="75F1496B">
-                <wp:simplePos x="0" y="0"/>
-                <wp:positionH relativeFrom="column">
-                  <wp:posOffset>2507615</wp:posOffset>
-                </wp:positionH>
-                <wp:positionV relativeFrom="paragraph">
-                  <wp:posOffset>226060</wp:posOffset>
+                  <wp:posOffset>664845</wp:posOffset>
                 </wp:positionV>
                 <wp:extent cx="127000" cy="95250"/>
                 <wp:effectExtent l="19050" t="19050" r="25400" b="38100"/>
@@ -1225,36 +1089,43 @@
                     </wps:wsp>
                   </a:graphicData>
                 </a:graphic>
+                <wp14:sizeRelH relativeFrom="margin">
+                  <wp14:pctWidth>0</wp14:pctWidth>
+                </wp14:sizeRelH>
+                <wp14:sizeRelV relativeFrom="margin">
+                  <wp14:pctHeight>0</wp14:pctHeight>
+                </wp14:sizeRelV>
               </wp:anchor>
             </w:drawing>
           </mc:Choice>
           <mc:Fallback>
             <w:pict>
-              <v:shapetype w14:anchorId="373CA7DF" id="_x0000_t4" coordsize="21600,21600" o:spt="4" path="m10800,l,10800,10800,21600,21600,10800xe">
+              <v:shapetype w14:anchorId="16ED0444" id="_x0000_t4" coordsize="21600,21600" o:spt="4" path="m10800,l,10800,10800,21600,21600,10800xe">
                 <v:stroke joinstyle="miter"/>
                 <v:path gradientshapeok="t" o:connecttype="rect" textboxrect="5400,5400,16200,16200"/>
               </v:shapetype>
-              <v:shape id="Rombo 4" o:spid="_x0000_s1026" type="#_x0000_t4" style="position:absolute;margin-left:197.45pt;margin-top:17.8pt;width:10pt;height:7.5pt;z-index:251660288;visibility:visible;mso-wrap-style:square;mso-wrap-distance-left:9pt;mso-wrap-distance-top:0;mso-wrap-distance-right:9pt;mso-wrap-distance-bottom:0;mso-position-horizontal:absolute;mso-position-horizontal-relative:text;mso-position-vertical:absolute;mso-position-vertical-relative:text;v-text-anchor:middle" o:gfxdata="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" fillcolor="black [3200]" strokecolor="black [480]" strokeweight="1pt"/>
+              <v:shape id="Rombo 4" o:spid="_x0000_s1026" type="#_x0000_t4" style="position:absolute;margin-left:195.95pt;margin-top:52.35pt;width:10pt;height:7.5pt;z-index:251660288;visibility:visible;mso-wrap-style:square;mso-width-percent:0;mso-height-percent:0;mso-wrap-distance-left:9pt;mso-wrap-distance-top:0;mso-wrap-distance-right:9pt;mso-wrap-distance-bottom:0;mso-position-horizontal:absolute;mso-position-horizontal-relative:text;mso-position-vertical:absolute;mso-position-vertical-relative:text;mso-width-percent:0;mso-height-percent:0;mso-width-relative:margin;mso-height-relative:margin;v-text-anchor:middle" o:gfxdata="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" fillcolor="black [3200]" strokecolor="black [480]" strokeweight="1pt"/>
             </w:pict>
           </mc:Fallback>
         </mc:AlternateContent>
       </w:r>
       <w:r>
         <w:rPr>
+          <w:rFonts w:ascii="Arial" w:hAnsi="Arial" w:cs="Arial"/>
           <w:noProof/>
         </w:rPr>
         <mc:AlternateContent>
           <mc:Choice Requires="wps">
             <w:drawing>
-              <wp:anchor distT="0" distB="0" distL="114300" distR="114300" simplePos="0" relativeHeight="251659264" behindDoc="0" locked="0" layoutInCell="1" allowOverlap="1" wp14:anchorId="0747867B" wp14:editId="7A9C1058">
+              <wp:anchor distT="0" distB="0" distL="114300" distR="114300" simplePos="0" relativeHeight="251659264" behindDoc="0" locked="0" layoutInCell="1" allowOverlap="1" wp14:anchorId="0747867B" wp14:editId="09F96AB5">
                 <wp:simplePos x="0" y="0"/>
                 <wp:positionH relativeFrom="column">
-                  <wp:posOffset>2545715</wp:posOffset>
+                  <wp:posOffset>2609215</wp:posOffset>
                 </wp:positionH>
                 <wp:positionV relativeFrom="paragraph">
-                  <wp:posOffset>270510</wp:posOffset>
+                  <wp:posOffset>702310</wp:posOffset>
                 </wp:positionV>
-                <wp:extent cx="577850" cy="0"/>
+                <wp:extent cx="508000" cy="0"/>
                 <wp:effectExtent l="0" t="0" r="0" b="0"/>
                 <wp:wrapNone/>
                 <wp:docPr id="876555772" name="Conector recto 3"/>
@@ -1266,7 +1137,7 @@
                       <wps:spPr>
                         <a:xfrm>
                           <a:off x="0" y="0"/>
-                          <a:ext cx="577850" cy="0"/>
+                          <a:ext cx="508000" cy="0"/>
                         </a:xfrm>
                         <a:prstGeom prst="line">
                           <a:avLst/>
@@ -1290,18 +1161,557 @@
                     </wps:wsp>
                   </a:graphicData>
                 </a:graphic>
+                <wp14:sizeRelH relativeFrom="margin">
+                  <wp14:pctWidth>0</wp14:pctWidth>
+                </wp14:sizeRelH>
+                <wp14:sizeRelV relativeFrom="margin">
+                  <wp14:pctHeight>0</wp14:pctHeight>
+                </wp14:sizeRelV>
               </wp:anchor>
             </w:drawing>
           </mc:Choice>
           <mc:Fallback>
             <w:pict>
-              <v:line w14:anchorId="07B2C15F" id="Conector recto 3" o:spid="_x0000_s1026" style="position:absolute;z-index:251659264;visibility:visible;mso-wrap-style:square;mso-wrap-distance-left:9pt;mso-wrap-distance-top:0;mso-wrap-distance-right:9pt;mso-wrap-distance-bottom:0;mso-position-horizontal:absolute;mso-position-horizontal-relative:text;mso-position-vertical:absolute;mso-position-vertical-relative:text" from="200.45pt,21.3pt" to="245.95pt,21.3pt" o:gfxdata="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" strokecolor="black [3200]" strokeweight="1.5pt">
+              <v:line w14:anchorId="11819D50" id="Conector recto 3" o:spid="_x0000_s1026" style="position:absolute;z-index:251659264;visibility:visible;mso-wrap-style:square;mso-width-percent:0;mso-height-percent:0;mso-wrap-distance-left:9pt;mso-wrap-distance-top:0;mso-wrap-distance-right:9pt;mso-wrap-distance-bottom:0;mso-position-horizontal:absolute;mso-position-horizontal-relative:text;mso-position-vertical:absolute;mso-position-vertical-relative:text;mso-width-percent:0;mso-height-percent:0;mso-width-relative:margin;mso-height-relative:margin" from="205.45pt,55.3pt" to="245.45pt,55.3pt" o:gfxdata="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" strokecolor="black [3200]" strokeweight="1.5pt">
                 <v:stroke joinstyle="miter"/>
               </v:line>
             </w:pict>
           </mc:Fallback>
         </mc:AlternateContent>
       </w:r>
+      <w:r>
+        <w:rPr>
+          <w:rFonts w:ascii="Arial" w:hAnsi="Arial" w:cs="Arial"/>
+        </w:rPr>
+        <w:br w:type="page"/>
+      </w:r>
+    </w:p>
+    <w:p>
+      <w:pPr>
+        <w:spacing w:line="360" w:lineRule="auto"/>
+        <w:rPr>
+          <w:rFonts w:ascii="Arial" w:hAnsi="Arial" w:cs="Arial"/>
+        </w:rPr>
+      </w:pPr>
+      <w:r>
+        <w:rPr>
+          <w:rFonts w:ascii="Arial" w:hAnsi="Arial" w:cs="Arial"/>
+        </w:rPr>
+        <w:lastRenderedPageBreak/>
+        <w:t>De manera breve se pueden explicar las funciones usadas:</w:t>
+      </w:r>
+    </w:p>
+    <w:p>
+      <w:pPr>
+        <w:spacing w:line="360" w:lineRule="auto"/>
+        <w:rPr>
+          <w:rFonts w:ascii="Arial" w:hAnsi="Arial" w:cs="Arial"/>
+        </w:rPr>
+      </w:pPr>
+      <w:proofErr w:type="spellStart"/>
+      <w:r>
+        <w:rPr>
+          <w:rFonts w:ascii="Arial" w:hAnsi="Arial" w:cs="Arial"/>
+        </w:rPr>
+        <w:t>Genletras</w:t>
+      </w:r>
+      <w:proofErr w:type="spellEnd"/>
+      <w:r>
+        <w:rPr>
+          <w:rFonts w:ascii="Arial" w:hAnsi="Arial" w:cs="Arial"/>
+        </w:rPr>
+        <w:t>() que genera letras entre a y z que son usadas para los códigos de los surtidores.</w:t>
+      </w:r>
+    </w:p>
+    <w:p>
+      <w:pPr>
+        <w:spacing w:line="360" w:lineRule="auto"/>
+        <w:rPr>
+          <w:rFonts w:ascii="Arial" w:hAnsi="Arial" w:cs="Arial"/>
+        </w:rPr>
+      </w:pPr>
+      <w:r>
+        <w:rPr>
+          <w:rFonts w:ascii="Arial" w:hAnsi="Arial" w:cs="Arial"/>
+        </w:rPr>
+        <w:t>Venta() pide todos los datos necesarios para generar la transacción (documento, tipo de combustible a comprar, región de compra) y genera un valor al azar para realizar la venta y guarda la hora actual.</w:t>
+      </w:r>
+    </w:p>
+    <w:p>
+      <w:pPr>
+        <w:spacing w:line="360" w:lineRule="auto"/>
+        <w:rPr>
+          <w:rFonts w:ascii="Arial" w:hAnsi="Arial" w:cs="Arial"/>
+        </w:rPr>
+      </w:pPr>
+      <w:proofErr w:type="spellStart"/>
+      <w:r>
+        <w:rPr>
+          <w:rFonts w:ascii="Arial" w:hAnsi="Arial" w:cs="Arial"/>
+        </w:rPr>
+        <w:t>Agrelimsurtidor</w:t>
+      </w:r>
+      <w:proofErr w:type="spellEnd"/>
+      <w:r>
+        <w:rPr>
+          <w:rFonts w:ascii="Arial" w:hAnsi="Arial" w:cs="Arial"/>
+        </w:rPr>
+        <w:t xml:space="preserve">() que da acceso a la creación y destrucción de surtidores tomando la estación a la que pertenece y asignando el código de la estación + una letra en el orden </w:t>
+      </w:r>
+      <w:r>
+        <w:rPr>
+          <w:rFonts w:ascii="Arial" w:hAnsi="Arial" w:cs="Arial"/>
+        </w:rPr>
+        <w:t>que se generan o eliminando toda la información sobre este.</w:t>
+      </w:r>
+    </w:p>
+    <w:p>
+      <w:pPr>
+        <w:spacing w:line="360" w:lineRule="auto"/>
+        <w:rPr>
+          <w:rFonts w:ascii="Arial" w:hAnsi="Arial" w:cs="Arial"/>
+        </w:rPr>
+      </w:pPr>
+      <w:proofErr w:type="spellStart"/>
+      <w:r>
+        <w:rPr>
+          <w:rFonts w:ascii="Arial" w:hAnsi="Arial" w:cs="Arial"/>
+        </w:rPr>
+        <w:t>Actdesactsurtidor</w:t>
+      </w:r>
+      <w:proofErr w:type="spellEnd"/>
+      <w:r>
+        <w:rPr>
+          <w:rFonts w:ascii="Arial" w:hAnsi="Arial" w:cs="Arial"/>
+        </w:rPr>
+        <w:t>() pide el valor que se quiere ingresar al surtidor (verdadero o falso) además de su identificador y se cambia o se indica que ya el surtidor se encontraba en ese estado de actividad.</w:t>
+      </w:r>
+    </w:p>
+    <w:p>
+      <w:pPr>
+        <w:spacing w:line="360" w:lineRule="auto"/>
+        <w:rPr>
+          <w:rFonts w:ascii="Arial" w:hAnsi="Arial" w:cs="Arial"/>
+        </w:rPr>
+      </w:pPr>
+      <w:r>
+        <w:rPr>
+          <w:rFonts w:ascii="Arial" w:hAnsi="Arial" w:cs="Arial"/>
+        </w:rPr>
+        <w:t xml:space="preserve">El mayor problema de desarrollo presentado fue la no </w:t>
+      </w:r>
+      <w:proofErr w:type="spellStart"/>
+      <w:r>
+        <w:rPr>
+          <w:rFonts w:ascii="Arial" w:hAnsi="Arial" w:cs="Arial"/>
+        </w:rPr>
+        <w:t>completación</w:t>
+      </w:r>
+      <w:proofErr w:type="spellEnd"/>
+      <w:r>
+        <w:rPr>
+          <w:rFonts w:ascii="Arial" w:hAnsi="Arial" w:cs="Arial"/>
+        </w:rPr>
+        <w:t xml:space="preserve"> de las funciones o la corrección de errores en ellas, algunas de ellas son:</w:t>
+      </w:r>
+    </w:p>
+    <w:p>
+      <w:pPr>
+        <w:spacing w:line="360" w:lineRule="auto"/>
+        <w:rPr>
+          <w:rFonts w:ascii="Arial" w:hAnsi="Arial" w:cs="Arial"/>
+        </w:rPr>
+      </w:pPr>
+      <w:proofErr w:type="spellStart"/>
+      <w:r>
+        <w:rPr>
+          <w:rFonts w:ascii="Arial" w:hAnsi="Arial" w:cs="Arial"/>
+        </w:rPr>
+        <w:t>a.</w:t>
+      </w:r>
+      <w:r>
+        <w:rPr>
+          <w:rFonts w:ascii="Arial" w:hAnsi="Arial" w:cs="Arial"/>
+        </w:rPr>
+        <w:t>Consultar</w:t>
+      </w:r>
+      <w:proofErr w:type="spellEnd"/>
+      <w:r>
+        <w:rPr>
+          <w:rFonts w:ascii="Arial" w:hAnsi="Arial" w:cs="Arial"/>
+        </w:rPr>
+        <w:t xml:space="preserve"> el histórico de transacciones de cada surtidor de la E/S. </w:t>
+      </w:r>
+    </w:p>
+    <w:p>
+      <w:pPr>
+        <w:spacing w:line="360" w:lineRule="auto"/>
+        <w:rPr>
+          <w:rFonts w:ascii="Arial" w:hAnsi="Arial" w:cs="Arial"/>
+        </w:rPr>
+      </w:pPr>
+      <w:r>
+        <w:rPr>
+          <w:rFonts w:ascii="Arial" w:hAnsi="Arial" w:cs="Arial"/>
+        </w:rPr>
+        <w:t>Como solución parcial se muestra el historial general</w:t>
+      </w:r>
+      <w:r>
+        <w:rPr>
+          <w:rFonts w:ascii="Arial" w:hAnsi="Arial" w:cs="Arial"/>
+        </w:rPr>
+        <w:t>, la solución pensada era pedir el código de estación y buscar basado en el código de cada surtidor las transacciones relacionadas.</w:t>
+      </w:r>
+    </w:p>
+    <w:p>
+      <w:pPr>
+        <w:spacing w:line="360" w:lineRule="auto"/>
+        <w:rPr>
+          <w:rFonts w:ascii="Arial" w:hAnsi="Arial" w:cs="Arial"/>
+        </w:rPr>
+      </w:pPr>
+      <w:proofErr w:type="spellStart"/>
+      <w:r>
+        <w:rPr>
+          <w:rFonts w:ascii="Arial" w:hAnsi="Arial" w:cs="Arial"/>
+        </w:rPr>
+        <w:t>b.</w:t>
+      </w:r>
+      <w:r>
+        <w:rPr>
+          <w:rFonts w:ascii="Arial" w:hAnsi="Arial" w:cs="Arial"/>
+        </w:rPr>
+        <w:t>Reportar</w:t>
+      </w:r>
+      <w:proofErr w:type="spellEnd"/>
+      <w:r>
+        <w:rPr>
+          <w:rFonts w:ascii="Arial" w:hAnsi="Arial" w:cs="Arial"/>
+        </w:rPr>
+        <w:t xml:space="preserve"> la cantidad de litros vendida según cada categoría de combustible.</w:t>
+      </w:r>
+    </w:p>
+    <w:p>
+      <w:pPr>
+        <w:spacing w:line="360" w:lineRule="auto"/>
+        <w:rPr>
+          <w:rFonts w:ascii="Arial" w:hAnsi="Arial" w:cs="Arial"/>
+        </w:rPr>
+      </w:pPr>
+      <w:r>
+        <w:rPr>
+          <w:rFonts w:ascii="Arial" w:hAnsi="Arial" w:cs="Arial"/>
+        </w:rPr>
+        <w:t>No implementada, la solución pensada era pedir el código de estación y buscar la información relacionada al combustible vendido y mostrarlo en pantalla.</w:t>
+      </w:r>
+    </w:p>
+    <w:p>
+      <w:pPr>
+        <w:spacing w:line="360" w:lineRule="auto"/>
+        <w:rPr>
+          <w:rFonts w:ascii="Arial" w:hAnsi="Arial" w:cs="Arial"/>
+        </w:rPr>
+      </w:pPr>
+      <w:r>
+        <w:rPr>
+          <w:rFonts w:ascii="Arial" w:hAnsi="Arial" w:cs="Arial"/>
+        </w:rPr>
+        <w:t>c.</w:t>
+      </w:r>
+      <w:r>
+        <w:t xml:space="preserve"> </w:t>
+      </w:r>
+      <w:r>
+        <w:rPr>
+          <w:rFonts w:ascii="Arial" w:hAnsi="Arial" w:cs="Arial"/>
+        </w:rPr>
+        <w:t>Asignar la capacidad del tanque de suministro, con un valor aleatorio entre 100 y 200 litros para cada una de las categorías</w:t>
+      </w:r>
+      <w:r>
+        <w:rPr>
+          <w:rFonts w:ascii="Arial" w:hAnsi="Arial" w:cs="Arial"/>
+        </w:rPr>
+        <w:t xml:space="preserve">. </w:t>
+      </w:r>
+    </w:p>
+    <w:p>
+      <w:pPr>
+        <w:spacing w:line="360" w:lineRule="auto"/>
+        <w:rPr>
+          <w:rFonts w:ascii="Arial" w:hAnsi="Arial" w:cs="Arial"/>
+        </w:rPr>
+      </w:pPr>
+      <w:r>
+        <w:rPr>
+          <w:rFonts w:ascii="Arial" w:hAnsi="Arial" w:cs="Arial"/>
+        </w:rPr>
+        <w:drawing>
+          <wp:anchor distT="0" distB="0" distL="114300" distR="114300" simplePos="0" relativeHeight="251665408" behindDoc="0" locked="0" layoutInCell="1" allowOverlap="1" wp14:anchorId="3009CB0A" wp14:editId="2EC8E56B">
+            <wp:simplePos x="0" y="0"/>
+            <wp:positionH relativeFrom="column">
+              <wp:posOffset>3161665</wp:posOffset>
+            </wp:positionH>
+            <wp:positionV relativeFrom="paragraph">
+              <wp:posOffset>7620</wp:posOffset>
+            </wp:positionV>
+            <wp:extent cx="3431802" cy="946150"/>
+            <wp:effectExtent l="0" t="0" r="0" b="6350"/>
+            <wp:wrapNone/>
+            <wp:docPr id="828472518" name="Imagen 1" descr="Texto&#10;&#10;Descripción generada automáticamente"/>
+            <wp:cNvGraphicFramePr>
+              <a:graphicFrameLocks xmlns:a="http://schemas.openxmlformats.org/drawingml/2006/main" noChangeAspect="1"/>
+            </wp:cNvGraphicFramePr>
+            <a:graphic xmlns:a="http://schemas.openxmlformats.org/drawingml/2006/main">
+              <a:graphicData uri="http://schemas.openxmlformats.org/drawingml/2006/picture">
+                <pic:pic xmlns:pic="http://schemas.openxmlformats.org/drawingml/2006/picture">
+                  <pic:nvPicPr>
+                    <pic:cNvPr id="828472518" name="Imagen 1" descr="Texto&#10;&#10;Descripción generada automáticamente"/>
+                    <pic:cNvPicPr/>
+                  </pic:nvPicPr>
+                  <pic:blipFill>
+                    <a:blip r:embed="rId4">
+                      <a:extLst>
+                        <a:ext uri="{28A0092B-C50C-407E-A947-70E740481C1C}">
+                          <a14:useLocalDpi xmlns:a14="http://schemas.microsoft.com/office/drawing/2010/main" val="0"/>
+                        </a:ext>
+                      </a:extLst>
+                    </a:blip>
+                    <a:stretch>
+                      <a:fillRect/>
+                    </a:stretch>
+                  </pic:blipFill>
+                  <pic:spPr>
+                    <a:xfrm>
+                      <a:off x="0" y="0"/>
+                      <a:ext cx="3431802" cy="946150"/>
+                    </a:xfrm>
+                    <a:prstGeom prst="rect">
+                      <a:avLst/>
+                    </a:prstGeom>
+                  </pic:spPr>
+                </pic:pic>
+              </a:graphicData>
+            </a:graphic>
+            <wp14:sizeRelH relativeFrom="margin">
+              <wp14:pctWidth>0</wp14:pctWidth>
+            </wp14:sizeRelH>
+            <wp14:sizeRelV relativeFrom="margin">
+              <wp14:pctHeight>0</wp14:pctHeight>
+            </wp14:sizeRelV>
+          </wp:anchor>
+        </w:drawing>
+      </w:r>
+      <w:r>
+        <w:rPr>
+          <w:rFonts w:ascii="Arial" w:hAnsi="Arial" w:cs="Arial"/>
+        </w:rPr>
+        <w:drawing>
+          <wp:inline distT="0" distB="0" distL="0" distR="0" wp14:anchorId="66EB2450" wp14:editId="37703413">
+            <wp:extent cx="3086531" cy="933580"/>
+            <wp:effectExtent l="0" t="0" r="0" b="0"/>
+            <wp:docPr id="653014885" name="Imagen 1" descr="Texto&#10;&#10;Descripción generada automáticamente"/>
+            <wp:cNvGraphicFramePr>
+              <a:graphicFrameLocks xmlns:a="http://schemas.openxmlformats.org/drawingml/2006/main" noChangeAspect="1"/>
+            </wp:cNvGraphicFramePr>
+            <a:graphic xmlns:a="http://schemas.openxmlformats.org/drawingml/2006/main">
+              <a:graphicData uri="http://schemas.openxmlformats.org/drawingml/2006/picture">
+                <pic:pic xmlns:pic="http://schemas.openxmlformats.org/drawingml/2006/picture">
+                  <pic:nvPicPr>
+                    <pic:cNvPr id="653014885" name="Imagen 1" descr="Texto&#10;&#10;Descripción generada automáticamente"/>
+                    <pic:cNvPicPr/>
+                  </pic:nvPicPr>
+                  <pic:blipFill>
+                    <a:blip r:embed="rId5"/>
+                    <a:stretch>
+                      <a:fillRect/>
+                    </a:stretch>
+                  </pic:blipFill>
+                  <pic:spPr>
+                    <a:xfrm>
+                      <a:off x="0" y="0"/>
+                      <a:ext cx="3086531" cy="933580"/>
+                    </a:xfrm>
+                    <a:prstGeom prst="rect">
+                      <a:avLst/>
+                    </a:prstGeom>
+                  </pic:spPr>
+                </pic:pic>
+              </a:graphicData>
+            </a:graphic>
+          </wp:inline>
+        </w:drawing>
+      </w:r>
+    </w:p>
+    <w:p>
+      <w:pPr>
+        <w:spacing w:line="360" w:lineRule="auto"/>
+        <w:rPr>
+          <w:rFonts w:ascii="Arial" w:hAnsi="Arial" w:cs="Arial"/>
+        </w:rPr>
+      </w:pPr>
+      <w:r>
+        <w:rPr>
+          <w:rFonts w:ascii="Arial" w:hAnsi="Arial" w:cs="Arial"/>
+        </w:rPr>
+        <w:lastRenderedPageBreak/>
+        <w:t>Implementado durante la generación de las estaciones de servicio pero no de manera separada.</w:t>
+      </w:r>
+    </w:p>
+    <w:p>
+      <w:pPr>
+        <w:spacing w:line="360" w:lineRule="auto"/>
+        <w:rPr>
+          <w:rFonts w:ascii="Arial" w:hAnsi="Arial" w:cs="Arial"/>
+        </w:rPr>
+      </w:pPr>
+      <w:r>
+        <w:rPr>
+          <w:rFonts w:ascii="Arial" w:hAnsi="Arial" w:cs="Arial"/>
+        </w:rPr>
+        <w:t>d.</w:t>
+      </w:r>
+      <w:r>
+        <w:t xml:space="preserve"> </w:t>
+      </w:r>
+      <w:r>
+        <w:rPr>
+          <w:rFonts w:ascii="Arial" w:hAnsi="Arial" w:cs="Arial"/>
+        </w:rPr>
+        <w:t>- Calcular el monto total de las ventas en cada E/S del país, discriminado por categoría de combustible.</w:t>
+      </w:r>
+    </w:p>
+    <w:p>
+      <w:pPr>
+        <w:spacing w:line="360" w:lineRule="auto"/>
+        <w:rPr>
+          <w:rFonts w:ascii="Arial" w:hAnsi="Arial" w:cs="Arial"/>
+        </w:rPr>
+      </w:pPr>
+      <w:r>
+        <w:rPr>
+          <w:rFonts w:ascii="Arial" w:hAnsi="Arial" w:cs="Arial"/>
+        </w:rPr>
+        <w:t xml:space="preserve">No implementado, la solución pensada era revisar el historial general y dependiendo </w:t>
+      </w:r>
+      <w:proofErr w:type="spellStart"/>
+      <w:r>
+        <w:rPr>
+          <w:rFonts w:ascii="Arial" w:hAnsi="Arial" w:cs="Arial"/>
+        </w:rPr>
+        <w:t>de el</w:t>
+      </w:r>
+      <w:proofErr w:type="spellEnd"/>
+      <w:r>
+        <w:rPr>
+          <w:rFonts w:ascii="Arial" w:hAnsi="Arial" w:cs="Arial"/>
+        </w:rPr>
+        <w:t xml:space="preserve"> tipo de combustible registrado se suman los valores de venta para mostrar 3 (la suma total de cada uno).</w:t>
+      </w:r>
+    </w:p>
+    <w:p>
+      <w:pPr>
+        <w:spacing w:line="360" w:lineRule="auto"/>
+        <w:rPr>
+          <w:rFonts w:ascii="Arial" w:hAnsi="Arial" w:cs="Arial"/>
+        </w:rPr>
+      </w:pPr>
+      <w:r>
+        <w:rPr>
+          <w:rFonts w:ascii="Arial" w:hAnsi="Arial" w:cs="Arial"/>
+        </w:rPr>
+        <w:drawing>
+          <wp:inline distT="0" distB="0" distL="0" distR="0" wp14:anchorId="2E9397CC" wp14:editId="0D76BCDF">
+            <wp:extent cx="5612130" cy="1237615"/>
+            <wp:effectExtent l="0" t="0" r="7620" b="635"/>
+            <wp:docPr id="1462182855" name="Imagen 1" descr="Texto&#10;&#10;Descripción generada automáticamente"/>
+            <wp:cNvGraphicFramePr>
+              <a:graphicFrameLocks xmlns:a="http://schemas.openxmlformats.org/drawingml/2006/main" noChangeAspect="1"/>
+            </wp:cNvGraphicFramePr>
+            <a:graphic xmlns:a="http://schemas.openxmlformats.org/drawingml/2006/main">
+              <a:graphicData uri="http://schemas.openxmlformats.org/drawingml/2006/picture">
+                <pic:pic xmlns:pic="http://schemas.openxmlformats.org/drawingml/2006/picture">
+                  <pic:nvPicPr>
+                    <pic:cNvPr id="1462182855" name="Imagen 1" descr="Texto&#10;&#10;Descripción generada automáticamente"/>
+                    <pic:cNvPicPr/>
+                  </pic:nvPicPr>
+                  <pic:blipFill>
+                    <a:blip r:embed="rId6"/>
+                    <a:stretch>
+                      <a:fillRect/>
+                    </a:stretch>
+                  </pic:blipFill>
+                  <pic:spPr>
+                    <a:xfrm>
+                      <a:off x="0" y="0"/>
+                      <a:ext cx="5612130" cy="1237615"/>
+                    </a:xfrm>
+                    <a:prstGeom prst="rect">
+                      <a:avLst/>
+                    </a:prstGeom>
+                  </pic:spPr>
+                </pic:pic>
+              </a:graphicData>
+            </a:graphic>
+          </wp:inline>
+        </w:drawing>
+      </w:r>
+    </w:p>
+    <w:p>
+      <w:pPr>
+        <w:spacing w:line="360" w:lineRule="auto"/>
+        <w:rPr>
+          <w:rFonts w:ascii="Arial" w:hAnsi="Arial" w:cs="Arial"/>
+        </w:rPr>
+      </w:pPr>
+      <w:r>
+        <w:rPr>
+          <w:rFonts w:ascii="Arial" w:hAnsi="Arial" w:cs="Arial"/>
+        </w:rPr>
+        <w:t>Aquí están definidas variables de control para la generación de códigos,</w:t>
+      </w:r>
+      <w:r>
+        <w:rPr>
+          <w:rFonts w:ascii="Arial" w:hAnsi="Arial" w:cs="Arial"/>
+        </w:rPr>
+        <w:t xml:space="preserve"> la matriz para controlar los precios por regiones y arreglos para guardar los identificadores de estaciones y surtidore</w:t>
+      </w:r>
+      <w:r>
+        <w:rPr>
+          <w:rFonts w:ascii="Arial" w:hAnsi="Arial" w:cs="Arial"/>
+        </w:rPr>
+        <w:t>s.</w:t>
+      </w:r>
+    </w:p>
+    <w:p>
+      <w:pPr>
+        <w:spacing w:line="360" w:lineRule="auto"/>
+        <w:rPr>
+          <w:rFonts w:ascii="Arial" w:hAnsi="Arial" w:cs="Arial"/>
+        </w:rPr>
+      </w:pPr>
+    </w:p>
+    <w:p>
+      <w:pPr>
+        <w:spacing w:line="360" w:lineRule="auto"/>
+        <w:rPr>
+          <w:rFonts w:ascii="Arial" w:hAnsi="Arial" w:cs="Arial"/>
+        </w:rPr>
+      </w:pPr>
+    </w:p>
+    <w:p>
+      <w:pPr>
+        <w:spacing w:line="360" w:lineRule="auto"/>
+        <w:rPr>
+          <w:rFonts w:ascii="Arial" w:hAnsi="Arial" w:cs="Arial"/>
+        </w:rPr>
+      </w:pPr>
+    </w:p>
+    <w:p>
+      <w:pPr>
+        <w:rPr>
+          <w:rFonts w:ascii="Arial" w:hAnsi="Arial" w:cs="Arial"/>
+        </w:rPr>
+      </w:pPr>
     </w:p>
     <w:sectPr>
       <w:pgSz w:w="12240" w:h="15840"/>

</xml_diff>